<commit_message>
Agrega el documento de refactorizacion y actualiza el de requerimientos
- Agrega docs/Refactorizacion FestivalCine (code smells, GRASP y SOLID)
- Requerimientos: actualiza donde se validan las reglas (seccion 4),
  los paquetes de RNF-03, la mencion a EntradaServicio (seccion 6), el
  paquete de inicializacion (seccion 7) y el modelo de clases (seccion 8);
  agrega RN-29 (sin personas, peliculas ni actores de reparto duplicados)

Co-Authored-By: Claude Opus 5.5 <noreply@anthropic.com>
</commit_message>
<xml_diff>
--- a/docs/Documento de Requerimientos - Grupo 10 ok.docx
+++ b/docs/Documento de Requerimientos - Grupo 10 ok.docx
@@ -5430,13 +5430,7 @@
         <w:spacing w:after="120"/>
       </w:pPr>
       <w:r>
-        <w:t>Las reglas se validan en las capas de modelo y servicios; además, los formularios de la interfaz controlan los datos ingresados</w:t>
-      </w:r>
-      <w:r>
-        <w:t xml:space="preserve">. </w:t>
-      </w:r>
-      <w:r>
-        <w:t>Si se intenta una operación que no las cumple, el sistema la rechaza con un mensaje que explica el motivo.</w:t>
+        <w:t xml:space="preserve">Las reglas se validan en las clases del modelo: cada entidad controla sus propios datos (por ejemplo, Edicion valida el año y las fechas, y FuncionPresencial valida la butaca). Los servicios coordinan cada operación y los formularios de la interfaz solo controlan el formato de los datos ingresados. Si se intenta una operación que no las cumple, el sistema la rechaza con un mensaje que explica el motivo.</w:t>
       </w:r>
     </w:p>
     <w:p>
@@ -7670,6 +7664,68 @@
           </w:p>
         </w:tc>
       </w:tr>
+      <w:tr>
+        <w:trPr>
+          <w:cantSplit/>
+        </w:trPr>
+        <w:tc>
+          <w:tcPr>
+            <w:tcW w:w="900" w:type="dxa"/>
+            <w:tcBorders>
+              <w:top w:val="single" w:sz="4" w:space="0" w:color="8EA9DB"/>
+              <w:left w:val="single" w:sz="4" w:space="0" w:color="8EA9DB"/>
+              <w:bottom w:val="single" w:sz="4" w:space="0" w:color="8EA9DB"/>
+              <w:right w:val="single" w:sz="4" w:space="0" w:color="8EA9DB"/>
+            </w:tcBorders>
+            <w:tcMar>
+              <w:top w:w="60" w:type="dxa"/>
+              <w:left w:w="100" w:type="dxa"/>
+              <w:bottom w:w="60" w:type="dxa"/>
+              <w:right w:w="100" w:type="dxa"/>
+            </w:tcMar>
+            <w:vAlign w:val="center"/>
+          </w:tcPr>
+          <w:p>
+            <w:pPr>
+              <w:jc w:val="center"/>
+            </w:pPr>
+            <w:r>
+              <w:rPr>
+                <w:sz w:val="19"/>
+                <w:szCs w:val="19"/>
+              </w:rPr>
+              <w:t>RN-29</w:t>
+            </w:r>
+          </w:p>
+        </w:tc>
+        <w:tc>
+          <w:tcPr>
+            <w:tcW w:w="8126" w:type="dxa"/>
+            <w:tcBorders>
+              <w:top w:val="single" w:sz="4" w:space="0" w:color="8EA9DB"/>
+              <w:left w:val="single" w:sz="4" w:space="0" w:color="8EA9DB"/>
+              <w:bottom w:val="single" w:sz="4" w:space="0" w:color="8EA9DB"/>
+              <w:right w:val="single" w:sz="4" w:space="0" w:color="8EA9DB"/>
+            </w:tcBorders>
+            <w:tcMar>
+              <w:top w:w="60" w:type="dxa"/>
+              <w:left w:w="100" w:type="dxa"/>
+              <w:bottom w:w="60" w:type="dxa"/>
+              <w:right w:w="100" w:type="dxa"/>
+            </w:tcMar>
+            <w:vAlign w:val="center"/>
+          </w:tcPr>
+          <w:p>
+            <w:r>
+              <w:rPr>
+                <w:sz w:val="19"/>
+                <w:szCs w:val="19"/>
+              </w:rPr>
+              <w:t xml:space="preserve">No puede haber dos personas con el mismo nombre en un mismo rol (director, actor, jurado o espectador), ni dos películas con el mismo título, ni el mismo actor dos veces en el reparto de una película.</w:t>
+            </w:r>
+          </w:p>
+        </w:tc>
+      </w:tr>
     </w:tbl>
     <w:p>
       <w:pPr>
@@ -8060,39 +8116,7 @@
                 <w:sz w:val="19"/>
                 <w:szCs w:val="19"/>
               </w:rPr>
-              <w:t xml:space="preserve">El código se organiza en los paquetes modelo, servicios, persistencia, excepciones, </w:t>
-            </w:r>
-            <w:proofErr w:type="spellStart"/>
-            <w:r>
-              <w:rPr>
-                <w:sz w:val="19"/>
-                <w:szCs w:val="19"/>
-              </w:rPr>
-              <w:t>ui</w:t>
-            </w:r>
-            <w:proofErr w:type="spellEnd"/>
-            <w:r>
-              <w:rPr>
-                <w:sz w:val="19"/>
-                <w:szCs w:val="19"/>
-              </w:rPr>
-              <w:t xml:space="preserve"> y </w:t>
-            </w:r>
-            <w:proofErr w:type="gramStart"/>
-            <w:r>
-              <w:rPr>
-                <w:sz w:val="19"/>
-                <w:szCs w:val="19"/>
-              </w:rPr>
-              <w:t>app</w:t>
-            </w:r>
-            <w:proofErr w:type="gramEnd"/>
-            <w:r>
-              <w:rPr>
-                <w:sz w:val="19"/>
-                <w:szCs w:val="19"/>
-              </w:rPr>
-              <w:t>. La lógica de negocio no se resuelve en la interfaz ni en la clase principal.</w:t>
+              <w:t xml:space="preserve">El código se organiza en los paquetes modelo, repositorio, servicios, persistencia, inicializacion, excepciones, ui y app. La lógica de negocio no se resuelve en la interfaz ni en la clase principal, y los servicios acceden a los datos a través de interfaces (Repositorio y Persistencia), no de clases concretas.</w:t>
             </w:r>
           </w:p>
         </w:tc>
@@ -9000,7 +9024,7 @@
                 <w:sz w:val="19"/>
                 <w:szCs w:val="19"/>
               </w:rPr>
-              <w:t>EntradaServicio</w:t>
+              <w:t>EntradaServicio (hoy dividido en FuncionServicio, VentaServicio y AbonoServicio)</w:t>
             </w:r>
             <w:proofErr w:type="spellEnd"/>
             <w:r>
@@ -9287,15 +9311,7 @@
         <w:spacing w:after="60"/>
       </w:pPr>
       <w:r>
-        <w:t xml:space="preserve">Se persisten en archivo las salas, directores, actores, jurados, espectadores, películas y evaluaciones. Las ediciones, secciones, funciones, entradas, abonos y votos se precargan al iniciar el sistema (clase </w:t>
-      </w:r>
-      <w:proofErr w:type="spellStart"/>
-      <w:r>
-        <w:t>InicializadorDatos</w:t>
-      </w:r>
-      <w:proofErr w:type="spellEnd"/>
-      <w:r>
-        <w:t>). Lo que se cargue en una sesión desde la interfaz para estas entidades se pierde al cerrar.</w:t>
+        <w:t xml:space="preserve">Se persisten en archivo las salas, directores, actores, jurados, espectadores, películas y evaluaciones. Las ediciones, secciones, funciones, entradas, abonos y votos se precargan al iniciar el sistema (paquete inicializacion). Lo que se cargue en una sesión desde la interfaz para estas entidades se pierde al cerrar.</w:t>
       </w:r>
     </w:p>
     <w:p>
@@ -9326,55 +9342,7 @@
         <w:spacing w:after="120"/>
       </w:pPr>
       <w:r>
-        <w:t xml:space="preserve">El diseño del sistema se documenta en el diagrama de clases UML entregado en el archivo </w:t>
-      </w:r>
-      <w:proofErr w:type="spellStart"/>
-      <w:r>
-        <w:t>uml</w:t>
-      </w:r>
-      <w:proofErr w:type="spellEnd"/>
-      <w:r>
-        <w:t>/</w:t>
-      </w:r>
-      <w:proofErr w:type="spellStart"/>
-      <w:r>
-        <w:t>FestivalCine.mdj</w:t>
-      </w:r>
-      <w:proofErr w:type="spellEnd"/>
-      <w:r>
-        <w:t xml:space="preserve"> (</w:t>
-      </w:r>
-      <w:proofErr w:type="spellStart"/>
-      <w:r>
-        <w:t>StarUML</w:t>
-      </w:r>
-      <w:proofErr w:type="spellEnd"/>
-      <w:r>
-        <w:t>). Contiene las 52 clases del proyecto organizadas en sus paquetes, más las clases de Java de las que heredan (</w:t>
-      </w:r>
-      <w:proofErr w:type="spellStart"/>
-      <w:r>
-        <w:t>RuntimeException</w:t>
-      </w:r>
-      <w:proofErr w:type="spellEnd"/>
-      <w:r>
-        <w:t xml:space="preserve">, </w:t>
-      </w:r>
-      <w:proofErr w:type="spellStart"/>
-      <w:r>
-        <w:t>Exception</w:t>
-      </w:r>
-      <w:proofErr w:type="spellEnd"/>
-      <w:r>
-        <w:t xml:space="preserve">, JFrame y </w:t>
-      </w:r>
-      <w:proofErr w:type="spellStart"/>
-      <w:r>
-        <w:t>JPanel</w:t>
-      </w:r>
-      <w:proofErr w:type="spellEnd"/>
-      <w:r>
-        <w:t>).</w:t>
+        <w:t xml:space="preserve">El diseño del sistema se documenta en el diagrama de clases UML entregado en el archivo uml/FestivalCine.mdj (StarUML). Contiene las 88 clases e interfaces del proyecto, tal como quedaron después de la refactorización, organizadas en sus paquetes, más las clases de Java de las que heredan (RuntimeException, Exception, JFrame y JPanel).</w:t>
       </w:r>
     </w:p>
     <w:p>
@@ -9427,7 +9395,7 @@
         <w:t xml:space="preserve">Modelo: </w:t>
       </w:r>
       <w:r>
-        <w:t>las 25 clases del dominio con atributos, métodos, herencias y asociaciones con multiplicidad.</w:t>
+        <w:t xml:space="preserve">las 31 clases del dominio (entidades, enums y el record SolicitudEntrada) con atributos, métodos, herencias y asociaciones con multiplicidad.</w:t>
       </w:r>
     </w:p>
     <w:p>
@@ -9444,26 +9412,10 @@
           <w:b/>
           <w:bCs/>
         </w:rPr>
-        <w:t xml:space="preserve">Servicios, persistencia y </w:t>
-      </w:r>
-      <w:proofErr w:type="gramStart"/>
-      <w:r>
-        <w:rPr>
-          <w:b/>
-          <w:bCs/>
-        </w:rPr>
-        <w:t>app</w:t>
-      </w:r>
-      <w:proofErr w:type="gramEnd"/>
-      <w:r>
-        <w:rPr>
-          <w:b/>
-          <w:bCs/>
-        </w:rPr>
-        <w:t xml:space="preserve">: </w:t>
+        <w:t xml:space="preserve">Servicios, repositorio, persistencia, inicialización y app: </w:t>
       </w:r>
       <w:r>
-        <w:t>la lógica de negocio, la persistencia en archivos y la clase principal.</w:t>
+        <w:t xml:space="preserve">los servicios que coordinan cada caso de uso, las interfaces Repositorio y Persistencia con sus implementaciones, la precarga de datos de demostración y la clase principal.</w:t>
       </w:r>
     </w:p>
     <w:p>
@@ -9480,26 +9432,10 @@
           <w:b/>
           <w:bCs/>
         </w:rPr>
-        <w:t>Interfaz (</w:t>
-      </w:r>
-      <w:proofErr w:type="spellStart"/>
-      <w:r>
-        <w:rPr>
-          <w:b/>
-          <w:bCs/>
-        </w:rPr>
-        <w:t>ui</w:t>
-      </w:r>
-      <w:proofErr w:type="spellEnd"/>
-      <w:r>
-        <w:rPr>
-          <w:b/>
-          <w:bCs/>
-        </w:rPr>
-        <w:t xml:space="preserve">): </w:t>
+        <w:t xml:space="preserve">Interfaz (ui): </w:t>
       </w:r>
       <w:r>
-        <w:t>la ventana principal y los 12 paneles Swing.</w:t>
+        <w:t xml:space="preserve">la ventana principal, los 12 paneles Swing y los componentes reutilizables del paquete ui.comun.</w:t>
       </w:r>
     </w:p>
     <w:p>

</xml_diff>

<commit_message>
Version final segunda entrega (correcciones de Juan
</commit_message>
<xml_diff>
--- a/docs/Documento de Requerimientos - Grupo 10 ok.docx
+++ b/docs/Documento de Requerimientos - Grupo 10 ok.docx
@@ -5430,7 +5430,13 @@
         <w:spacing w:after="120"/>
       </w:pPr>
       <w:r>
-        <w:t xml:space="preserve">Las reglas se validan en las clases del modelo: cada entidad controla sus propios datos (por ejemplo, Edicion valida el año y las fechas, y FuncionPresencial valida la butaca). Los servicios coordinan cada operación y los formularios de la interfaz solo controlan el formato de los datos ingresados. Si se intenta una operación que no las cumple, el sistema la rechaza con un mensaje que explica el motivo.</w:t>
+        <w:t>Las reglas se validan en las capas de modelo y servicios; además, los formularios de la interfaz controlan los datos ingresados</w:t>
+      </w:r>
+      <w:r>
+        <w:t xml:space="preserve">. </w:t>
+      </w:r>
+      <w:r>
+        <w:t>Si se intenta una operación que no las cumple, el sistema la rechaza con un mensaje que explica el motivo.</w:t>
       </w:r>
     </w:p>
     <w:p>
@@ -7664,68 +7670,6 @@
           </w:p>
         </w:tc>
       </w:tr>
-      <w:tr>
-        <w:trPr>
-          <w:cantSplit/>
-        </w:trPr>
-        <w:tc>
-          <w:tcPr>
-            <w:tcW w:w="900" w:type="dxa"/>
-            <w:tcBorders>
-              <w:top w:val="single" w:sz="4" w:space="0" w:color="8EA9DB"/>
-              <w:left w:val="single" w:sz="4" w:space="0" w:color="8EA9DB"/>
-              <w:bottom w:val="single" w:sz="4" w:space="0" w:color="8EA9DB"/>
-              <w:right w:val="single" w:sz="4" w:space="0" w:color="8EA9DB"/>
-            </w:tcBorders>
-            <w:tcMar>
-              <w:top w:w="60" w:type="dxa"/>
-              <w:left w:w="100" w:type="dxa"/>
-              <w:bottom w:w="60" w:type="dxa"/>
-              <w:right w:w="100" w:type="dxa"/>
-            </w:tcMar>
-            <w:vAlign w:val="center"/>
-          </w:tcPr>
-          <w:p>
-            <w:pPr>
-              <w:jc w:val="center"/>
-            </w:pPr>
-            <w:r>
-              <w:rPr>
-                <w:sz w:val="19"/>
-                <w:szCs w:val="19"/>
-              </w:rPr>
-              <w:t>RN-29</w:t>
-            </w:r>
-          </w:p>
-        </w:tc>
-        <w:tc>
-          <w:tcPr>
-            <w:tcW w:w="8126" w:type="dxa"/>
-            <w:tcBorders>
-              <w:top w:val="single" w:sz="4" w:space="0" w:color="8EA9DB"/>
-              <w:left w:val="single" w:sz="4" w:space="0" w:color="8EA9DB"/>
-              <w:bottom w:val="single" w:sz="4" w:space="0" w:color="8EA9DB"/>
-              <w:right w:val="single" w:sz="4" w:space="0" w:color="8EA9DB"/>
-            </w:tcBorders>
-            <w:tcMar>
-              <w:top w:w="60" w:type="dxa"/>
-              <w:left w:w="100" w:type="dxa"/>
-              <w:bottom w:w="60" w:type="dxa"/>
-              <w:right w:w="100" w:type="dxa"/>
-            </w:tcMar>
-            <w:vAlign w:val="center"/>
-          </w:tcPr>
-          <w:p>
-            <w:r>
-              <w:rPr>
-                <w:sz w:val="19"/>
-                <w:szCs w:val="19"/>
-              </w:rPr>
-              <w:t xml:space="preserve">No puede haber dos personas con el mismo nombre en un mismo rol (director, actor, jurado o espectador), ni dos películas con el mismo título, ni el mismo actor dos veces en el reparto de una película.</w:t>
-            </w:r>
-          </w:p>
-        </w:tc>
-      </w:tr>
     </w:tbl>
     <w:p>
       <w:pPr>
@@ -8116,7 +8060,39 @@
                 <w:sz w:val="19"/>
                 <w:szCs w:val="19"/>
               </w:rPr>
-              <w:t xml:space="preserve">El código se organiza en los paquetes modelo, repositorio, servicios, persistencia, inicializacion, excepciones, ui y app. La lógica de negocio no se resuelve en la interfaz ni en la clase principal, y los servicios acceden a los datos a través de interfaces (Repositorio y Persistencia), no de clases concretas.</w:t>
+              <w:t xml:space="preserve">El código se organiza en los paquetes modelo, servicios, persistencia, excepciones, </w:t>
+            </w:r>
+            <w:proofErr w:type="spellStart"/>
+            <w:r>
+              <w:rPr>
+                <w:sz w:val="19"/>
+                <w:szCs w:val="19"/>
+              </w:rPr>
+              <w:t>ui</w:t>
+            </w:r>
+            <w:proofErr w:type="spellEnd"/>
+            <w:r>
+              <w:rPr>
+                <w:sz w:val="19"/>
+                <w:szCs w:val="19"/>
+              </w:rPr>
+              <w:t xml:space="preserve"> y </w:t>
+            </w:r>
+            <w:proofErr w:type="gramStart"/>
+            <w:r>
+              <w:rPr>
+                <w:sz w:val="19"/>
+                <w:szCs w:val="19"/>
+              </w:rPr>
+              <w:t>app</w:t>
+            </w:r>
+            <w:proofErr w:type="gramEnd"/>
+            <w:r>
+              <w:rPr>
+                <w:sz w:val="19"/>
+                <w:szCs w:val="19"/>
+              </w:rPr>
+              <w:t>. La lógica de negocio no se resuelve en la interfaz ni en la clase principal.</w:t>
             </w:r>
           </w:p>
         </w:tc>
@@ -9024,7 +9000,7 @@
                 <w:sz w:val="19"/>
                 <w:szCs w:val="19"/>
               </w:rPr>
-              <w:t>EntradaServicio (hoy dividido en FuncionServicio, VentaServicio y AbonoServicio)</w:t>
+              <w:t>EntradaServicio</w:t>
             </w:r>
             <w:proofErr w:type="spellEnd"/>
             <w:r>
@@ -9311,7 +9287,15 @@
         <w:spacing w:after="60"/>
       </w:pPr>
       <w:r>
-        <w:t xml:space="preserve">Se persisten en archivo las salas, directores, actores, jurados, espectadores, películas y evaluaciones. Las ediciones, secciones, funciones, entradas, abonos y votos se precargan al iniciar el sistema (paquete inicializacion). Lo que se cargue en una sesión desde la interfaz para estas entidades se pierde al cerrar.</w:t>
+        <w:t xml:space="preserve">Se persisten en archivo las salas, directores, actores, jurados, espectadores, películas y evaluaciones. Las ediciones, secciones, funciones, entradas, abonos y votos se precargan al iniciar el sistema (clase </w:t>
+      </w:r>
+      <w:proofErr w:type="spellStart"/>
+      <w:r>
+        <w:t>InicializadorDatos</w:t>
+      </w:r>
+      <w:proofErr w:type="spellEnd"/>
+      <w:r>
+        <w:t>). Lo que se cargue en una sesión desde la interfaz para estas entidades se pierde al cerrar.</w:t>
       </w:r>
     </w:p>
     <w:p>
@@ -9342,7 +9326,55 @@
         <w:spacing w:after="120"/>
       </w:pPr>
       <w:r>
-        <w:t xml:space="preserve">El diseño del sistema se documenta en el diagrama de clases UML entregado en el archivo uml/FestivalCine.mdj (StarUML). Contiene las 88 clases e interfaces del proyecto, tal como quedaron después de la refactorización, organizadas en sus paquetes, más las clases de Java de las que heredan (RuntimeException, Exception, JFrame y JPanel).</w:t>
+        <w:t xml:space="preserve">El diseño del sistema se documenta en el diagrama de clases UML entregado en el archivo </w:t>
+      </w:r>
+      <w:proofErr w:type="spellStart"/>
+      <w:r>
+        <w:t>uml</w:t>
+      </w:r>
+      <w:proofErr w:type="spellEnd"/>
+      <w:r>
+        <w:t>/</w:t>
+      </w:r>
+      <w:proofErr w:type="spellStart"/>
+      <w:r>
+        <w:t>FestivalCine.mdj</w:t>
+      </w:r>
+      <w:proofErr w:type="spellEnd"/>
+      <w:r>
+        <w:t xml:space="preserve"> (</w:t>
+      </w:r>
+      <w:proofErr w:type="spellStart"/>
+      <w:r>
+        <w:t>StarUML</w:t>
+      </w:r>
+      <w:proofErr w:type="spellEnd"/>
+      <w:r>
+        <w:t>). Contiene las 52 clases del proyecto organizadas en sus paquetes, más las clases de Java de las que heredan (</w:t>
+      </w:r>
+      <w:proofErr w:type="spellStart"/>
+      <w:r>
+        <w:t>RuntimeException</w:t>
+      </w:r>
+      <w:proofErr w:type="spellEnd"/>
+      <w:r>
+        <w:t xml:space="preserve">, </w:t>
+      </w:r>
+      <w:proofErr w:type="spellStart"/>
+      <w:r>
+        <w:t>Exception</w:t>
+      </w:r>
+      <w:proofErr w:type="spellEnd"/>
+      <w:r>
+        <w:t xml:space="preserve">, JFrame y </w:t>
+      </w:r>
+      <w:proofErr w:type="spellStart"/>
+      <w:r>
+        <w:t>JPanel</w:t>
+      </w:r>
+      <w:proofErr w:type="spellEnd"/>
+      <w:r>
+        <w:t>).</w:t>
       </w:r>
     </w:p>
     <w:p>
@@ -9395,7 +9427,7 @@
         <w:t xml:space="preserve">Modelo: </w:t>
       </w:r>
       <w:r>
-        <w:t xml:space="preserve">las 31 clases del dominio (entidades, enums y el record SolicitudEntrada) con atributos, métodos, herencias y asociaciones con multiplicidad.</w:t>
+        <w:t>las 25 clases del dominio con atributos, métodos, herencias y asociaciones con multiplicidad.</w:t>
       </w:r>
     </w:p>
     <w:p>
@@ -9412,10 +9444,26 @@
           <w:b/>
           <w:bCs/>
         </w:rPr>
-        <w:t xml:space="preserve">Servicios, repositorio, persistencia, inicialización y app: </w:t>
+        <w:t xml:space="preserve">Servicios, persistencia y </w:t>
+      </w:r>
+      <w:proofErr w:type="gramStart"/>
+      <w:r>
+        <w:rPr>
+          <w:b/>
+          <w:bCs/>
+        </w:rPr>
+        <w:t>app</w:t>
+      </w:r>
+      <w:proofErr w:type="gramEnd"/>
+      <w:r>
+        <w:rPr>
+          <w:b/>
+          <w:bCs/>
+        </w:rPr>
+        <w:t xml:space="preserve">: </w:t>
       </w:r>
       <w:r>
-        <w:t xml:space="preserve">los servicios que coordinan cada caso de uso, las interfaces Repositorio y Persistencia con sus implementaciones, la precarga de datos de demostración y la clase principal.</w:t>
+        <w:t>la lógica de negocio, la persistencia en archivos y la clase principal.</w:t>
       </w:r>
     </w:p>
     <w:p>
@@ -9432,10 +9480,26 @@
           <w:b/>
           <w:bCs/>
         </w:rPr>
-        <w:t xml:space="preserve">Interfaz (ui): </w:t>
+        <w:t>Interfaz (</w:t>
+      </w:r>
+      <w:proofErr w:type="spellStart"/>
+      <w:r>
+        <w:rPr>
+          <w:b/>
+          <w:bCs/>
+        </w:rPr>
+        <w:t>ui</w:t>
+      </w:r>
+      <w:proofErr w:type="spellEnd"/>
+      <w:r>
+        <w:rPr>
+          <w:b/>
+          <w:bCs/>
+        </w:rPr>
+        <w:t xml:space="preserve">): </w:t>
       </w:r>
       <w:r>
-        <w:t xml:space="preserve">la ventana principal, los 12 paneles Swing y los componentes reutilizables del paquete ui.comun.</w:t>
+        <w:t>la ventana principal y los 12 paneles Swing.</w:t>
       </w:r>
     </w:p>
     <w:p>

</xml_diff>